<commit_message>
Update Redundancy Changelog: current stats, Memgraph migration, CVD filter fix
- Disease ontology: 90 → 184 terms
- Gene count: 4,411 → 3,984 (LOC* loci + OMIM phenotype symbols removed)
- Graph stats: 4.9M nodes / 7.7M relationships / 43 edge types
- Stale sources reclassified as "Retained" (no live API alternatives)
- Migration notes reference Memgraph instead of Neo4j
- New Section 10: CVD Edge Filter Fix (OR→AND logic, word-boundary
  regex, node-type guard, Memgraph regex compat) — documents the
  53% non-CVD edge removal

Co-Authored-By: Claude Opus 4.6 <noreply@anthropic.com>
</commit_message>
<xml_diff>
--- a/docs/CardioKB_Redundancy_Changelog.docx
+++ b/docs/CardioKB_Redundancy_Changelog.docx
@@ -75,11 +75,9 @@
         <w:rPr>
           <w:b/>
         </w:rPr>
-        <w:t xml:space="preserve">CVD pivot: </w:t>
+        <w:t>CVD pivot: Officially scoped the knowledge graph to cardiovascular disease. Created CVD-specific ontology files for genes (3,984 symbols from OMIM + DisGeNET, cleaned of LOC* loci and OMIM phenotype symbols), node types (19), edge types (43), and diseases (184 terms, expanded from original 90).</w:t>
       </w:r>
-      <w:r>
-        <w:t>Officially scoped the knowledge graph to cardiovascular disease. Created CVD-specific ontology files for genes (4,411 symbols from OMIM + DisGeNET), node types (19), edge types (41), and diseases (90 terms, existing).</w:t>
-      </w:r>
+      <w:r/>
     </w:p>
     <w:p>
       <w:pPr>
@@ -89,11 +87,9 @@
         <w:rPr>
           <w:b/>
         </w:rPr>
-        <w:t xml:space="preserve">Stale source analysis: </w:t>
+        <w:t>Legacy source analysis: Identified 3 legacy sources (SIDER, LINCS L1000, MEDLINE) pinned to archived GitHub commits. Investigated replacements; all retained as-is — no live API alternatives available (clue.io requires institutional access, MEDLINE cooccurrence provides unique anatomy/symptom edges not covered by PubTator).</w:t>
       </w:r>
-      <w:r>
-        <w:t>Identified 3 stale sources (SIDER, LINCS L1000, MEDLINE) pinned to archived GitHub commits. Proposed live replacements: DrugBank adverse reactions, clue.io API, PubTator cooccurrence expansion.</w:t>
-      </w:r>
+      <w:r/>
     </w:p>
     <w:p>
       <w:pPr>
@@ -1813,7 +1809,7 @@
           </w:tcPr>
           <w:p>
             <w:r>
-              <w:t>2,364,224 (OpenTargets)</w:t>
+              <w:t>7,564,685 (OpenTargets)</w:t>
             </w:r>
           </w:p>
         </w:tc>
@@ -1823,7 +1819,7 @@
           </w:tcPr>
           <w:p>
             <w:r>
-              <w:t>1,342,446</w:t>
+              <w:t>+3,857,015 (EFO-to-DOID expansion)</w:t>
             </w:r>
           </w:p>
         </w:tc>
@@ -1855,7 +1851,7 @@
           </w:tcPr>
           <w:p>
             <w:r>
-              <w:t>229,433 (STRING)</w:t>
+              <w:t>121,170 (STRING, confidence &gt; 700)</w:t>
             </w:r>
           </w:p>
         </w:tc>
@@ -1865,7 +1861,7 @@
           </w:tcPr>
           <w:p>
             <w:r>
-              <w:t>5,100</w:t>
+              <w:t>113,363</w:t>
             </w:r>
           </w:p>
         </w:tc>
@@ -1897,7 +1893,7 @@
           </w:tcPr>
           <w:p>
             <w:r>
-              <w:t>16,317 (Reactome)</w:t>
+              <w:t>44,979 (Reactome)</w:t>
             </w:r>
           </w:p>
         </w:tc>
@@ -1907,7 +1903,7 @@
           </w:tcPr>
           <w:p>
             <w:r>
-              <w:t>27,066</w:t>
+              <w:t>+1,596</w:t>
             </w:r>
           </w:p>
         </w:tc>
@@ -1939,7 +1935,7 @@
           </w:tcPr>
           <w:p>
             <w:r>
-              <w:t>16,317 (Reactome)</w:t>
+              <w:t>44,979 (Reactome)</w:t>
             </w:r>
           </w:p>
         </w:tc>
@@ -1949,7 +1945,7 @@
           </w:tcPr>
           <w:p>
             <w:r>
-              <w:t>27,066</w:t>
+              <w:t>+1,596</w:t>
             </w:r>
           </w:p>
         </w:tc>
@@ -1958,7 +1954,7 @@
     <w:p/>
     <w:p>
       <w:r>
-        <w:t>Total edges removed from redundancy: ~1.4M. These were duplicate assertions of the same biological relationships from lower-priority sources. The r.source property on remaining edges unambiguously identifies the authoritative database.</w:t>
+        <w:t>Current graph totals: 4,896,243 nodes | 7,656,733 relationships | 19 node types | 43 relationship types | 26 sources | 21 relationship source labels. The r.source property on all edges unambiguously identifies the authoritative database.</w:t>
       </w:r>
     </w:p>
     <w:p>
@@ -2081,7 +2077,7 @@
           </w:tcPr>
           <w:p>
             <w:r>
-              <w:t>Extend DrugBank parser to extract adverse reactions from XML</w:t>
+              <w:t>Retained as-is — DrugBank XML lacks structured adverse reaction frequency data</w:t>
             </w:r>
           </w:p>
         </w:tc>
@@ -2091,7 +2087,7 @@
           </w:tcPr>
           <w:p>
             <w:r>
-              <w:t>Planned</w:t>
+              <w:t>Retained</w:t>
             </w:r>
           </w:p>
         </w:tc>
@@ -2123,7 +2119,7 @@
           </w:tcPr>
           <w:p>
             <w:r>
-              <w:t>Replace with clue.io REST API for live L1000 data</w:t>
+              <w:t>Retained as-is — clue.io REST API requires institutional access credentials</w:t>
             </w:r>
           </w:p>
         </w:tc>
@@ -2133,7 +2129,7 @@
           </w:tcPr>
           <w:p>
             <w:r>
-              <w:t>Planned</w:t>
+              <w:t>Retained</w:t>
             </w:r>
           </w:p>
         </w:tc>
@@ -2165,7 +2161,7 @@
           </w:tcPr>
           <w:p>
             <w:r>
-              <w:t>Expand PubTator Central parser to include disease-symptom and disease-anatomy cooccurrence</w:t>
+              <w:t>Retained as-is — PubTator provides disease-disease but not anatomy/symptom cooccurrence</w:t>
             </w:r>
           </w:p>
         </w:tc>
@@ -2175,7 +2171,7 @@
           </w:tcPr>
           <w:p>
             <w:r>
-              <w:t>Planned</w:t>
+              <w:t>Retained</w:t>
             </w:r>
           </w:p>
         </w:tc>
@@ -2297,7 +2293,7 @@
           </w:tcPr>
           <w:p>
             <w:r>
-              <w:t>All 41 edge types with source/target node types, source databases, edge counts</w:t>
+              <w:t>All 43 edge types with source/target node types, source databases, edge counts</w:t>
             </w:r>
           </w:p>
         </w:tc>
@@ -2307,7 +2303,7 @@
           </w:tcPr>
           <w:p>
             <w:r>
-              <w:t>41 types</w:t>
+              <w:t>43 types</w:t>
             </w:r>
           </w:p>
         </w:tc>
@@ -2329,7 +2325,7 @@
           </w:tcPr>
           <w:p>
             <w:r>
-              <w:t>CVD-associated gene symbols merged from OMIM (1,652) + DisGeNET (3,488), deduplicated</w:t>
+              <w:t>CVD-associated gene symbols merged from OMIM + DisGeNET, deduplicated, cleaned of LOC* loci and OMIM phenotype symbols</w:t>
             </w:r>
           </w:p>
         </w:tc>
@@ -2339,7 +2335,7 @@
           </w:tcPr>
           <w:p>
             <w:r>
-              <w:t>4,411 genes</w:t>
+              <w:t>3,984 genes</w:t>
             </w:r>
           </w:p>
         </w:tc>
@@ -2361,7 +2357,7 @@
           </w:tcPr>
           <w:p>
             <w:r>
-              <w:t>CVD disease terms for filtering (existing file, unchanged)</w:t>
+              <w:t>CVD disease terms for filtering (expanded from 90 to 184 terms with subcategory coverage)</w:t>
             </w:r>
           </w:p>
         </w:tc>
@@ -2371,7 +2367,7 @@
           </w:tcPr>
           <w:p>
             <w:r>
-              <w:t>90 terms</w:t>
+              <w:t>184 terms</w:t>
             </w:r>
           </w:p>
         </w:tc>
@@ -2457,7 +2453,7 @@
     </w:p>
     <w:p>
       <w:r>
-        <w:t>The following steps are required to apply these changes to the live Neo4j database:</w:t>
+        <w:t>The following steps are required to apply these changes to the Memgraph database:</w:t>
       </w:r>
     </w:p>
     <w:p>
@@ -2496,11 +2492,9 @@
         <w:rPr>
           <w:b/>
         </w:rPr>
-        <w:t xml:space="preserve">Clean Neo4j: </w:t>
+        <w:t>Clean Memgraph: Delete edges from removed sources: MATCH ()-[r]-&gt;() WHERE r.source IN ["DisGeNET","GWAS Catalog","Jensen DISEASES","OMIM","WikiPathways","AOP-DB","Hetionet"] DELETE r</w:t>
       </w:r>
-      <w:r>
-        <w:t>Delete edges from removed sources: MATCH ()-[r]-&gt;() WHERE r.source IN ["DisGeNET","GWAS Catalog","Jensen DISEASES","OMIM","WikiPathways","AOP-DB","Hetionet"] DELETE r</w:t>
-      </w:r>
+      <w:r/>
     </w:p>
     <w:p>
       <w:pPr>
@@ -2528,6 +2522,144 @@
       </w:r>
       <w:r>
         <w:t>Run health check to confirm all 26 sources are loaded with expected edge counts</w:t>
+      </w:r>
+    </w:p>
+    <w:p>
+      <w:pPr>
+        <w:pStyle w:val="Heading1"/>
+      </w:pPr>
+      <w:r>
+        <w:t>10. CVD Edge Filter Fix (OR→AND Logic)</w:t>
+      </w:r>
+    </w:p>
+    <w:p>
+      <w:r>
+        <w:t>Applied in commit a892212 (April 8, 2026). The original edge filtering logic used OR semantics: an edge passed the CVD filter if at least one endpoint was CVD-relevant. This allowed non-CVD diseases (breast cancer, lymphoma, Alzheimer's, etc.) to leak into the graph through edges where only one side was cardiovascular-related.</w:t>
+      </w:r>
+    </w:p>
+    <w:p>
+      <w:pPr>
+        <w:pStyle w:val="Heading2"/>
+      </w:pPr>
+      <w:r>
+        <w:t>10.1. Changes Applied</w:t>
+      </w:r>
+    </w:p>
+    <w:p>
+      <w:pPr>
+        <w:pStyle w:val="ListBullet"/>
+      </w:pPr>
+      <w:r>
+        <w:rPr>
+          <w:b/>
+        </w:rPr>
+        <w:t xml:space="preserve">OR→AND logic: </w:t>
+      </w:r>
+      <w:r>
+        <w:t>For Gene↔Disease edges, the disease endpoint must match a CVD term or DOID. For Disease↔Disease edges, BOTH disease endpoints must be CVD-relevant. Gene↔Gene edges require at least one gene in the CVD gene list (unchanged).</w:t>
+      </w:r>
+    </w:p>
+    <w:p>
+      <w:pPr>
+        <w:pStyle w:val="ListBullet"/>
+      </w:pPr>
+      <w:r>
+        <w:rPr>
+          <w:b/>
+        </w:rPr>
+        <w:t xml:space="preserve">Word-boundary regex: </w:t>
+      </w:r>
+      <w:r>
+        <w:t>Replaced substring matching with word-boundary patterns to prevent false positives (e.g., "mi" matching "luminal", "pe" matching "peripheral"). Reduced false-positive DOIDs from 3,440 to 302 legitimate CVD DOIDs.</w:t>
+      </w:r>
+    </w:p>
+    <w:p>
+      <w:pPr>
+        <w:pStyle w:val="ListBullet"/>
+      </w:pPr>
+      <w:r>
+        <w:rPr>
+          <w:b/>
+        </w:rPr>
+        <w:t xml:space="preserve">Node-type guard: </w:t>
+      </w:r>
+      <w:r>
+        <w:t>commonName property matching now checks that node type is "Disease" before counting as a disease match. Fixes Jensen TISSUES regression where BodyPart nodes share the commonName property.</w:t>
+      </w:r>
+    </w:p>
+    <w:p>
+      <w:pPr>
+        <w:pStyle w:val="ListBullet"/>
+      </w:pPr>
+      <w:r>
+        <w:rPr>
+          <w:b/>
+        </w:rPr>
+        <w:t xml:space="preserve">Memgraph regex compatibility: </w:t>
+      </w:r>
+      <w:r>
+        <w:t>Updated _tag_cvd_diseases() to use toLower() + CONTAINS instead of Java-style \b word boundaries and (?i) assertions unsupported by Memgraph.</w:t>
+      </w:r>
+    </w:p>
+    <w:p>
+      <w:pPr>
+        <w:pStyle w:val="Heading2"/>
+      </w:pPr>
+      <w:r>
+        <w:t>10.2. Impact</w:t>
+      </w:r>
+    </w:p>
+    <w:p>
+      <w:r>
+        <w:t>Before the fix, the graph contained approximately 16.3M relationships. After applying strict CVD scoping, this dropped to 7.7M relationships — roughly 53% of edges were non-CVD and are now excluded. Node count remains at 4.9M (nodes are not filtered by disease scope). The pipeline must be rerun to apply this fix to the live Memgraph database.</w:t>
+      </w:r>
+    </w:p>
+    <w:p>
+      <w:pPr>
+        <w:pStyle w:val="Heading2"/>
+      </w:pPr>
+      <w:r>
+        <w:t>10.3. Files Modified</w:t>
+      </w:r>
+    </w:p>
+    <w:p>
+      <w:pPr>
+        <w:pStyle w:val="ListBullet"/>
+      </w:pPr>
+      <w:r>
+        <w:t>src/memgraph_loader.py (renamed from neo4j_loader.py) — AND-logic filtering, word-boundary regex</w:t>
+      </w:r>
+    </w:p>
+    <w:p>
+      <w:pPr>
+        <w:pStyle w:val="ListBullet"/>
+      </w:pPr>
+      <w:r>
+        <w:t>src/utils.py — get_disease_search_pattern() returns compiled word-boundary regex</w:t>
+      </w:r>
+    </w:p>
+    <w:p>
+      <w:pPr>
+        <w:pStyle w:val="ListBullet"/>
+      </w:pPr>
+      <w:r>
+        <w:t>src/main.py — _tag_cvd_diseases() uses Memgraph-compatible toLower()+CONTAINS</w:t>
+      </w:r>
+    </w:p>
+    <w:p>
+      <w:pPr>
+        <w:pStyle w:val="ListBullet"/>
+      </w:pPr>
+      <w:r>
+        <w:t>ontology/diseases/cvd.txt — expanded from 90 to 184 terms</w:t>
+      </w:r>
+    </w:p>
+    <w:p>
+      <w:pPr>
+        <w:pStyle w:val="ListBullet"/>
+      </w:pPr>
+      <w:r>
+        <w:t>ontology/genes/cvd.txt — cleaned from 4,411 to 3,984 genes (removed LOC* loci)</w:t>
       </w:r>
     </w:p>
     <w:sectPr>

</xml_diff>